<commit_message>
Phase 8 hardening, plus report and UI fixes from testing
Phase 8: token usage and usage dashboard, audit log viewer, retention sweep
and project-delete purge, upload content sniffing, SSRF guard for spec
imports, Prometheus metrics, pip-audit in CI, performance measurement,
user and admin guides.

Also: generic OpenAI-compatible AI provider; session refresh on 401 and in
Next middleware; loading states, optimistic checkbox updates, back buttons,
password reveal, and a reworked test case generation page; report drafts
limited to feature descriptions with N/A exceptions and an empty comments
box; editable result analysis; approval signature upload and paste; report
template typography, fixed-width comments box, and continuous result-table
section.

Co-Authored-By: Claude Sonnet 5 <noreply@anthropic.com>
</commit_message>
<xml_diff>
--- a/templates/tokenized/QA_Test_Report_Template.docx
+++ b/templates/tokenized/QA_Test_Report_Template.docx
@@ -198,19 +198,21 @@
             </w:pPr>
             <w:r>
               <w:rPr>
-                <w:rFonts w:ascii="Century Gothic" w:hAnsi="Century Gothic"/>
+                <w:rFonts w:ascii="Tahoma" w:hAnsi="Tahoma"/>
                 <w:b/>
                 <w:color w:val="FFFFFF"/>
                 <w:spacing w:val="-8"/>
+                <w:sz w:val="20"/>
               </w:rPr>
               <w:t xml:space="preserve">Product </w:t>
             </w:r>
             <w:r>
               <w:rPr>
-                <w:rFonts w:ascii="Century Gothic" w:hAnsi="Century Gothic"/>
+                <w:rFonts w:ascii="Tahoma" w:hAnsi="Tahoma"/>
                 <w:b/>
                 <w:color w:val="FFFFFF"/>
                 <w:spacing w:val="-4"/>
+                <w:sz w:val="20"/>
               </w:rPr>
               <w:t>Name</w:t>
             </w:r>
@@ -231,6 +233,11 @@
               </w:rPr>
             </w:pPr>
             <w:r>
+              <w:rPr>
+                <w:rFonts w:ascii="Verdana" w:hAnsi="Verdana"/>
+                <w:b w:val="0"/>
+                <w:sz w:val="22"/>
+              </w:rPr>
               <w:t>{{ product_name }}</w:t>
             </w:r>
           </w:p>
@@ -273,18 +280,20 @@
             </w:pPr>
             <w:r>
               <w:rPr>
-                <w:rFonts w:ascii="Century Gothic" w:hAnsi="Century Gothic"/>
+                <w:rFonts w:ascii="Tahoma" w:hAnsi="Tahoma"/>
                 <w:b/>
                 <w:color w:val="FFFFFF"/>
                 <w:spacing w:val="-10"/>
+                <w:sz w:val="20"/>
               </w:rPr>
               <w:t xml:space="preserve">Pre-master </w:t>
             </w:r>
             <w:r>
               <w:rPr>
-                <w:rFonts w:ascii="Century Gothic" w:hAnsi="Century Gothic"/>
+                <w:rFonts w:ascii="Tahoma" w:hAnsi="Tahoma"/>
                 <w:b/>
                 <w:color w:val="FFFFFF"/>
+                <w:sz w:val="20"/>
               </w:rPr>
               <w:t>PR Link</w:t>
             </w:r>
@@ -304,6 +313,11 @@
               </w:rPr>
             </w:pPr>
             <w:r>
+              <w:rPr>
+                <w:rFonts w:ascii="Verdana" w:hAnsi="Verdana"/>
+                <w:b w:val="0"/>
+                <w:sz w:val="22"/>
+              </w:rPr>
               <w:t>{%p for l in pr_links %}</w:t>
             </w:r>
           </w:p>
@@ -316,6 +330,11 @@
               </w:rPr>
             </w:pPr>
             <w:r>
+              <w:rPr>
+                <w:rFonts w:ascii="Verdana" w:hAnsi="Verdana"/>
+                <w:b w:val="0"/>
+                <w:sz w:val="22"/>
+              </w:rPr>
               <w:t>{{ l }}</w:t>
             </w:r>
           </w:p>
@@ -328,6 +347,11 @@
               </w:rPr>
             </w:pPr>
             <w:r>
+              <w:rPr>
+                <w:rFonts w:ascii="Verdana" w:hAnsi="Verdana"/>
+                <w:b w:val="0"/>
+                <w:sz w:val="22"/>
+              </w:rPr>
               <w:t>{%p endfor %}</w:t>
             </w:r>
           </w:p>
@@ -370,19 +394,21 @@
             </w:pPr>
             <w:r>
               <w:rPr>
-                <w:rFonts w:ascii="Century Gothic" w:hAnsi="Century Gothic"/>
+                <w:rFonts w:ascii="Tahoma" w:hAnsi="Tahoma"/>
                 <w:b/>
                 <w:color w:val="FFFFFF"/>
                 <w:spacing w:val="-2"/>
+                <w:sz w:val="20"/>
               </w:rPr>
               <w:t xml:space="preserve">Version </w:t>
             </w:r>
             <w:r>
               <w:rPr>
-                <w:rFonts w:ascii="Century Gothic" w:hAnsi="Century Gothic"/>
+                <w:rFonts w:ascii="Tahoma" w:hAnsi="Tahoma"/>
                 <w:b/>
                 <w:color w:val="FFFFFF"/>
                 <w:spacing w:val="-6"/>
+                <w:sz w:val="20"/>
               </w:rPr>
               <w:t>Number</w:t>
             </w:r>
@@ -405,6 +431,11 @@
               </w:rPr>
             </w:pPr>
             <w:r>
+              <w:rPr>
+                <w:rFonts w:ascii="Verdana" w:hAnsi="Verdana"/>
+                <w:b w:val="0"/>
+                <w:sz w:val="22"/>
+              </w:rPr>
               <w:t>{%p for v in version_numbers %}</w:t>
             </w:r>
           </w:p>
@@ -420,6 +451,11 @@
               </w:rPr>
             </w:pPr>
             <w:r>
+              <w:rPr>
+                <w:rFonts w:ascii="Verdana" w:hAnsi="Verdana"/>
+                <w:b w:val="0"/>
+                <w:sz w:val="22"/>
+              </w:rPr>
               <w:t>{{ v }}</w:t>
             </w:r>
           </w:p>
@@ -435,6 +471,11 @@
               </w:rPr>
             </w:pPr>
             <w:r>
+              <w:rPr>
+                <w:rFonts w:ascii="Verdana" w:hAnsi="Verdana"/>
+                <w:b w:val="0"/>
+                <w:sz w:val="22"/>
+              </w:rPr>
               <w:t>{%p endfor %}</w:t>
             </w:r>
           </w:p>
@@ -477,30 +518,33 @@
             </w:pPr>
             <w:r>
               <w:rPr>
-                <w:rFonts w:ascii="Century Gothic" w:hAnsi="Century Gothic"/>
+                <w:rFonts w:ascii="Tahoma" w:hAnsi="Tahoma"/>
                 <w:b/>
                 <w:color w:val="FFFFFF"/>
                 <w:w w:val="85"/>
+                <w:sz w:val="20"/>
               </w:rPr>
               <w:t>Test</w:t>
             </w:r>
             <w:r>
               <w:rPr>
-                <w:rFonts w:ascii="Century Gothic" w:hAnsi="Century Gothic"/>
+                <w:rFonts w:ascii="Tahoma" w:hAnsi="Tahoma"/>
                 <w:b/>
                 <w:color w:val="FFFFFF"/>
                 <w:spacing w:val="-2"/>
                 <w:w w:val="85"/>
+                <w:sz w:val="20"/>
               </w:rPr>
               <w:t xml:space="preserve"> </w:t>
             </w:r>
             <w:r>
               <w:rPr>
-                <w:rFonts w:ascii="Century Gothic" w:hAnsi="Century Gothic"/>
+                <w:rFonts w:ascii="Tahoma" w:hAnsi="Tahoma"/>
                 <w:b/>
                 <w:color w:val="FFFFFF"/>
                 <w:spacing w:val="-5"/>
                 <w:w w:val="90"/>
+                <w:sz w:val="20"/>
               </w:rPr>
               <w:t>URL</w:t>
             </w:r>
@@ -521,6 +565,11 @@
               </w:rPr>
             </w:pPr>
             <w:r>
+              <w:rPr>
+                <w:rFonts w:ascii="Verdana" w:hAnsi="Verdana"/>
+                <w:b w:val="0"/>
+                <w:sz w:val="22"/>
+              </w:rPr>
               <w:t>{{ test_url }}</w:t>
             </w:r>
           </w:p>
@@ -563,36 +612,40 @@
             </w:pPr>
             <w:r>
               <w:rPr>
-                <w:rFonts w:ascii="Century Gothic" w:hAnsi="Century Gothic"/>
+                <w:rFonts w:ascii="Tahoma" w:hAnsi="Tahoma"/>
                 <w:b/>
                 <w:color w:val="FFFFFF"/>
                 <w:spacing w:val="-2"/>
                 <w:w w:val="90"/>
+                <w:sz w:val="20"/>
               </w:rPr>
               <w:t xml:space="preserve">Workitem/ </w:t>
             </w:r>
             <w:r>
               <w:rPr>
-                <w:rFonts w:ascii="Century Gothic" w:hAnsi="Century Gothic"/>
+                <w:rFonts w:ascii="Tahoma" w:hAnsi="Tahoma"/>
                 <w:b/>
                 <w:color w:val="FFFFFF"/>
+                <w:sz w:val="20"/>
               </w:rPr>
               <w:t>Repo</w:t>
             </w:r>
             <w:r>
               <w:rPr>
-                <w:rFonts w:ascii="Century Gothic" w:hAnsi="Century Gothic"/>
+                <w:rFonts w:ascii="Tahoma" w:hAnsi="Tahoma"/>
                 <w:b/>
                 <w:color w:val="FFFFFF"/>
                 <w:spacing w:val="-11"/>
+                <w:sz w:val="20"/>
               </w:rPr>
               <w:t xml:space="preserve"> </w:t>
             </w:r>
             <w:r>
               <w:rPr>
-                <w:rFonts w:ascii="Century Gothic" w:hAnsi="Century Gothic"/>
+                <w:rFonts w:ascii="Tahoma" w:hAnsi="Tahoma"/>
                 <w:b/>
                 <w:color w:val="FFFFFF"/>
+                <w:sz w:val="20"/>
               </w:rPr>
               <w:t>URL</w:t>
             </w:r>
@@ -613,6 +666,11 @@
               </w:rPr>
             </w:pPr>
             <w:r>
+              <w:rPr>
+                <w:rFonts w:ascii="Verdana" w:hAnsi="Verdana"/>
+                <w:b w:val="0"/>
+                <w:sz w:val="22"/>
+              </w:rPr>
               <w:t>{{ workitem_url }}</w:t>
             </w:r>
           </w:p>
@@ -655,28 +713,31 @@
             </w:pPr>
             <w:r>
               <w:rPr>
-                <w:rFonts w:ascii="Century Gothic" w:hAnsi="Century Gothic"/>
+                <w:rFonts w:ascii="Tahoma" w:hAnsi="Tahoma"/>
                 <w:b/>
                 <w:color w:val="FFFFFF"/>
                 <w:spacing w:val="-7"/>
+                <w:sz w:val="20"/>
               </w:rPr>
               <w:t>Jira</w:t>
             </w:r>
             <w:r>
               <w:rPr>
-                <w:rFonts w:ascii="Century Gothic" w:hAnsi="Century Gothic"/>
+                <w:rFonts w:ascii="Tahoma" w:hAnsi="Tahoma"/>
                 <w:b/>
                 <w:color w:val="FFFFFF"/>
                 <w:spacing w:val="-9"/>
+                <w:sz w:val="20"/>
               </w:rPr>
               <w:t xml:space="preserve"> </w:t>
             </w:r>
             <w:r>
               <w:rPr>
-                <w:rFonts w:ascii="Century Gothic" w:hAnsi="Century Gothic"/>
+                <w:rFonts w:ascii="Tahoma" w:hAnsi="Tahoma"/>
                 <w:b/>
                 <w:color w:val="FFFFFF"/>
                 <w:spacing w:val="-4"/>
+                <w:sz w:val="20"/>
               </w:rPr>
               <w:t>Link</w:t>
             </w:r>
@@ -700,6 +761,11 @@
             <w:bookmarkStart w:id="0" w:name="_GoBack"/>
             <w:bookmarkEnd w:id="0"/>
             <w:r>
+              <w:rPr>
+                <w:rFonts w:ascii="Verdana" w:hAnsi="Verdana"/>
+                <w:b w:val="0"/>
+                <w:sz w:val="22"/>
+              </w:rPr>
               <w:t>{{ jira_link }}</w:t>
             </w:r>
           </w:p>
@@ -742,28 +808,31 @@
             </w:pPr>
             <w:r>
               <w:rPr>
-                <w:rFonts w:ascii="Century Gothic" w:hAnsi="Century Gothic"/>
+                <w:rFonts w:ascii="Tahoma" w:hAnsi="Tahoma"/>
                 <w:b/>
                 <w:color w:val="FFFFFF"/>
                 <w:spacing w:val="-2"/>
+                <w:sz w:val="20"/>
               </w:rPr>
               <w:t xml:space="preserve">General </w:t>
             </w:r>
             <w:r>
               <w:rPr>
-                <w:rFonts w:ascii="Century Gothic" w:hAnsi="Century Gothic"/>
+                <w:rFonts w:ascii="Tahoma" w:hAnsi="Tahoma"/>
                 <w:b/>
                 <w:color w:val="FFFFFF"/>
                 <w:spacing w:val="-8"/>
+                <w:sz w:val="20"/>
               </w:rPr>
               <w:t xml:space="preserve">Descriptio </w:t>
             </w:r>
             <w:r>
               <w:rPr>
-                <w:rFonts w:ascii="Century Gothic" w:hAnsi="Century Gothic"/>
+                <w:rFonts w:ascii="Tahoma" w:hAnsi="Tahoma"/>
                 <w:b/>
                 <w:color w:val="FFFFFF"/>
                 <w:spacing w:val="-10"/>
+                <w:sz w:val="20"/>
               </w:rPr>
               <w:t>n</w:t>
             </w:r>
@@ -784,6 +853,11 @@
               </w:rPr>
             </w:pPr>
             <w:r>
+              <w:rPr>
+                <w:rFonts w:ascii="Verdana" w:hAnsi="Verdana"/>
+                <w:b w:val="0"/>
+                <w:sz w:val="22"/>
+              </w:rPr>
               <w:t>{{ general_description }}</w:t>
             </w:r>
           </w:p>
@@ -865,6 +939,11 @@
         </w:rPr>
       </w:pPr>
       <w:r>
+        <w:rPr>
+          <w:rFonts w:ascii="Tahoma" w:hAnsi="Tahoma"/>
+          <w:b/>
+          <w:sz w:val="20"/>
+        </w:rPr>
         <w:t>Is this build certified for deployment?</w:t>
         <w:tab/>
         <w:t>Yes {{ cert_yes_box }}</w:t>
@@ -1042,7 +1121,7 @@
             </w:pPr>
             <w:r>
               <w:rPr>
-                <w:rFonts w:ascii="Tahoma"/>
+                <w:rFonts w:ascii="Tahoma" w:hAnsi="Tahoma"/>
                 <w:b/>
                 <w:color w:val="FFFFFF"/>
                 <w:spacing w:val="-5"/>
@@ -1071,7 +1150,7 @@
             </w:pPr>
             <w:r>
               <w:rPr>
-                <w:rFonts w:ascii="Tahoma"/>
+                <w:rFonts w:ascii="Tahoma" w:hAnsi="Tahoma"/>
                 <w:b/>
                 <w:color w:val="FFFFFF"/>
                 <w:spacing w:val="-2"/>
@@ -1099,7 +1178,7 @@
             </w:pPr>
             <w:r>
               <w:rPr>
-                <w:rFonts w:ascii="Tahoma"/>
+                <w:rFonts w:ascii="Tahoma" w:hAnsi="Tahoma"/>
                 <w:b/>
                 <w:color w:val="FFFFFF"/>
                 <w:spacing w:val="-2"/>
@@ -1127,7 +1206,7 @@
             </w:pPr>
             <w:r>
               <w:rPr>
-                <w:rFonts w:ascii="Tahoma"/>
+                <w:rFonts w:ascii="Tahoma" w:hAnsi="Tahoma"/>
                 <w:b/>
                 <w:color w:val="FFFFFF"/>
                 <w:spacing w:val="-2"/>
@@ -1155,7 +1234,7 @@
             </w:pPr>
             <w:r>
               <w:rPr>
-                <w:rFonts w:ascii="Tahoma"/>
+                <w:rFonts w:ascii="Tahoma" w:hAnsi="Tahoma"/>
                 <w:b/>
                 <w:color w:val="FFFFFF"/>
                 <w:spacing w:val="-2"/>
@@ -1249,6 +1328,11 @@
               </w:rPr>
             </w:pPr>
             <w:r>
+              <w:rPr>
+                <w:rFonts w:ascii="Verdana" w:hAnsi="Verdana"/>
+                <w:b w:val="0"/>
+                <w:sz w:val="22"/>
+              </w:rPr>
               <w:t>{%tr for f in features %}</w:t>
             </w:r>
           </w:p>
@@ -1267,7 +1351,13 @@
                 <w:szCs w:val="20"/>
               </w:rPr>
             </w:pPr>
-            <w:r/>
+            <w:r>
+              <w:rPr>
+                <w:rFonts w:ascii="Tahoma" w:hAnsi="Tahoma"/>
+                <w:b/>
+                <w:sz w:val="20"/>
+              </w:rPr>
+            </w:r>
           </w:p>
         </w:tc>
         <w:tc>
@@ -1284,7 +1374,13 @@
                 <w:szCs w:val="20"/>
               </w:rPr>
             </w:pPr>
-            <w:r/>
+            <w:r>
+              <w:rPr>
+                <w:rFonts w:ascii="Tahoma" w:hAnsi="Tahoma"/>
+                <w:b/>
+                <w:sz w:val="20"/>
+              </w:rPr>
+            </w:r>
           </w:p>
         </w:tc>
         <w:tc>
@@ -1305,7 +1401,13 @@
                 <w:szCs w:val="20"/>
               </w:rPr>
             </w:pPr>
-            <w:r/>
+            <w:r>
+              <w:rPr>
+                <w:rFonts w:ascii="Tahoma" w:hAnsi="Tahoma"/>
+                <w:b/>
+                <w:sz w:val="20"/>
+              </w:rPr>
+            </w:r>
           </w:p>
         </w:tc>
         <w:tc>
@@ -1326,7 +1428,13 @@
                 <w:szCs w:val="20"/>
               </w:rPr>
             </w:pPr>
-            <w:r/>
+            <w:r>
+              <w:rPr>
+                <w:rFonts w:ascii="Tahoma" w:hAnsi="Tahoma"/>
+                <w:b/>
+                <w:sz w:val="20"/>
+              </w:rPr>
+            </w:r>
           </w:p>
         </w:tc>
       </w:tr>
@@ -1366,6 +1474,11 @@
               </w:rPr>
             </w:pPr>
             <w:r>
+              <w:rPr>
+                <w:rFonts w:ascii="Tahoma" w:hAnsi="Tahoma"/>
+                <w:b/>
+                <w:sz w:val="20"/>
+              </w:rPr>
               <w:t>{{ loop.index }}.</w:t>
             </w:r>
           </w:p>
@@ -1385,6 +1498,11 @@
               </w:rPr>
             </w:pPr>
             <w:r>
+              <w:rPr>
+                <w:rFonts w:ascii="Verdana" w:hAnsi="Verdana"/>
+                <w:b w:val="0"/>
+                <w:sz w:val="22"/>
+              </w:rPr>
               <w:t>{{ f.name }}</w:t>
             </w:r>
           </w:p>
@@ -1404,6 +1522,11 @@
               </w:rPr>
             </w:pPr>
             <w:r>
+              <w:rPr>
+                <w:rFonts w:ascii="Verdana" w:hAnsi="Verdana"/>
+                <w:b w:val="0"/>
+                <w:sz w:val="22"/>
+              </w:rPr>
               <w:t>{{ f.description }}</w:t>
             </w:r>
           </w:p>
@@ -1427,6 +1550,11 @@
               </w:rPr>
             </w:pPr>
             <w:r>
+              <w:rPr>
+                <w:rFonts w:ascii="Verdana" w:hAnsi="Verdana"/>
+                <w:b w:val="0"/>
+                <w:sz w:val="22"/>
+              </w:rPr>
               <w:t>{{ f.impl_yes }} Yes {{ f.impl_no }} No</w:t>
             </w:r>
           </w:p>
@@ -1450,6 +1578,11 @@
               </w:rPr>
             </w:pPr>
             <w:r>
+              <w:rPr>
+                <w:rFonts w:ascii="Verdana" w:hAnsi="Verdana"/>
+                <w:b w:val="0"/>
+                <w:sz w:val="22"/>
+              </w:rPr>
               <w:t>{{ f.func_yes }} Yes {{ f.func_no }} No</w:t>
             </w:r>
           </w:p>
@@ -1491,6 +1624,11 @@
               </w:rPr>
             </w:pPr>
             <w:r>
+              <w:rPr>
+                <w:rFonts w:ascii="Verdana" w:hAnsi="Verdana"/>
+                <w:b w:val="0"/>
+                <w:sz w:val="22"/>
+              </w:rPr>
               <w:t>{%tr endfor %}</w:t>
             </w:r>
           </w:p>
@@ -1509,7 +1647,13 @@
                 <w:szCs w:val="20"/>
               </w:rPr>
             </w:pPr>
-            <w:r/>
+            <w:r>
+              <w:rPr>
+                <w:rFonts w:ascii="Tahoma" w:hAnsi="Tahoma"/>
+                <w:b/>
+                <w:sz w:val="20"/>
+              </w:rPr>
+            </w:r>
           </w:p>
         </w:tc>
         <w:tc>
@@ -1526,7 +1670,13 @@
                 <w:szCs w:val="20"/>
               </w:rPr>
             </w:pPr>
-            <w:r/>
+            <w:r>
+              <w:rPr>
+                <w:rFonts w:ascii="Tahoma" w:hAnsi="Tahoma"/>
+                <w:b/>
+                <w:sz w:val="20"/>
+              </w:rPr>
+            </w:r>
           </w:p>
         </w:tc>
         <w:tc>
@@ -1547,7 +1697,13 @@
                 <w:szCs w:val="20"/>
               </w:rPr>
             </w:pPr>
-            <w:r/>
+            <w:r>
+              <w:rPr>
+                <w:rFonts w:ascii="Tahoma" w:hAnsi="Tahoma"/>
+                <w:b/>
+                <w:sz w:val="20"/>
+              </w:rPr>
+            </w:r>
           </w:p>
         </w:tc>
         <w:tc>
@@ -1568,7 +1724,13 @@
                 <w:szCs w:val="20"/>
               </w:rPr>
             </w:pPr>
-            <w:r/>
+            <w:r>
+              <w:rPr>
+                <w:rFonts w:ascii="Tahoma" w:hAnsi="Tahoma"/>
+                <w:b/>
+                <w:sz w:val="20"/>
+              </w:rPr>
+            </w:r>
           </w:p>
         </w:tc>
       </w:tr>
@@ -1724,7 +1886,7 @@
             </w:pPr>
             <w:r>
               <w:rPr>
-                <w:rFonts w:ascii="Tahoma"/>
+                <w:rFonts w:ascii="Tahoma" w:hAnsi="Tahoma"/>
                 <w:b/>
                 <w:color w:val="FFFFFF"/>
                 <w:spacing w:val="-5"/>
@@ -1757,7 +1919,7 @@
             </w:pPr>
             <w:r>
               <w:rPr>
-                <w:rFonts w:ascii="Tahoma"/>
+                <w:rFonts w:ascii="Tahoma" w:hAnsi="Tahoma"/>
                 <w:b/>
                 <w:color w:val="FFFFFF"/>
                 <w:spacing w:val="-2"/>
@@ -1807,6 +1969,11 @@
               </w:rPr>
             </w:pPr>
             <w:r>
+              <w:rPr>
+                <w:rFonts w:ascii="Verdana" w:hAnsi="Verdana"/>
+                <w:b w:val="0"/>
+                <w:sz w:val="22"/>
+              </w:rPr>
               <w:t>{%tr for c in exit_criteria %}</w:t>
             </w:r>
           </w:p>
@@ -1829,7 +1996,13 @@
                 <w:sz w:val="20"/>
               </w:rPr>
             </w:pPr>
-            <w:r/>
+            <w:r>
+              <w:rPr>
+                <w:rFonts w:ascii="Tahoma" w:hAnsi="Tahoma"/>
+                <w:b/>
+                <w:sz w:val="20"/>
+              </w:rPr>
+            </w:r>
           </w:p>
         </w:tc>
       </w:tr>
@@ -1872,6 +2045,11 @@
               </w:rPr>
             </w:pPr>
             <w:r>
+              <w:rPr>
+                <w:rFonts w:ascii="Tahoma" w:hAnsi="Tahoma"/>
+                <w:b/>
+                <w:sz w:val="20"/>
+              </w:rPr>
               <w:t>{{ loop.index }}.</w:t>
             </w:r>
           </w:p>
@@ -1895,6 +2073,11 @@
               </w:rPr>
             </w:pPr>
             <w:r>
+              <w:rPr>
+                <w:rFonts w:ascii="Verdana" w:hAnsi="Verdana"/>
+                <w:b w:val="0"/>
+                <w:sz w:val="22"/>
+              </w:rPr>
               <w:t>{{ c }}</w:t>
             </w:r>
           </w:p>
@@ -1939,6 +2122,11 @@
               </w:rPr>
             </w:pPr>
             <w:r>
+              <w:rPr>
+                <w:rFonts w:ascii="Verdana" w:hAnsi="Verdana"/>
+                <w:b w:val="0"/>
+                <w:sz w:val="22"/>
+              </w:rPr>
               <w:t>{%tr endfor %}</w:t>
             </w:r>
           </w:p>
@@ -1961,7 +2149,13 @@
                 <w:sz w:val="20"/>
               </w:rPr>
             </w:pPr>
-            <w:r/>
+            <w:r>
+              <w:rPr>
+                <w:rFonts w:ascii="Tahoma" w:hAnsi="Tahoma"/>
+                <w:b/>
+                <w:sz w:val="20"/>
+              </w:rPr>
+            </w:r>
           </w:p>
         </w:tc>
       </w:tr>
@@ -2151,7 +2345,7 @@
             </w:pPr>
             <w:r>
               <w:rPr>
-                <w:rFonts w:ascii="Century Gothic" w:hAnsi="Century Gothic"/>
+                <w:rFonts w:ascii="Tahoma" w:hAnsi="Tahoma"/>
                 <w:b/>
                 <w:color w:val="FFFFFF"/>
                 <w:w w:val="85"/>
@@ -2161,7 +2355,7 @@
             </w:r>
             <w:r>
               <w:rPr>
-                <w:rFonts w:ascii="Century Gothic" w:hAnsi="Century Gothic"/>
+                <w:rFonts w:ascii="Tahoma" w:hAnsi="Tahoma"/>
                 <w:b/>
                 <w:color w:val="FFFFFF"/>
                 <w:spacing w:val="-1"/>
@@ -2171,7 +2365,7 @@
             </w:r>
             <w:r>
               <w:rPr>
-                <w:rFonts w:ascii="Century Gothic" w:hAnsi="Century Gothic"/>
+                <w:rFonts w:ascii="Tahoma" w:hAnsi="Tahoma"/>
                 <w:b/>
                 <w:color w:val="FFFFFF"/>
                 <w:w w:val="85"/>
@@ -2181,7 +2375,7 @@
             </w:r>
             <w:r>
               <w:rPr>
-                <w:rFonts w:ascii="Century Gothic" w:hAnsi="Century Gothic"/>
+                <w:rFonts w:ascii="Tahoma" w:hAnsi="Tahoma"/>
                 <w:b/>
                 <w:color w:val="FFFFFF"/>
                 <w:spacing w:val="-1"/>
@@ -2191,7 +2385,7 @@
             </w:r>
             <w:r>
               <w:rPr>
-                <w:rFonts w:ascii="Century Gothic" w:hAnsi="Century Gothic"/>
+                <w:rFonts w:ascii="Tahoma" w:hAnsi="Tahoma"/>
                 <w:b/>
                 <w:color w:val="FFFFFF"/>
                 <w:spacing w:val="-2"/>
@@ -2254,7 +2448,8 @@
             </w:pPr>
             <w:r>
               <w:rPr>
-                <w:rFonts w:ascii="Century Gothic" w:hAnsi="Century Gothic"/>
+                <w:rFonts w:ascii="Tahoma" w:hAnsi="Tahoma"/>
+                <w:b/>
                 <w:spacing w:val="-2"/>
                 <w:w w:val="85"/>
                 <w:sz w:val="20"/>
@@ -2263,7 +2458,8 @@
             </w:r>
             <w:r>
               <w:rPr>
-                <w:rFonts w:ascii="Century Gothic" w:hAnsi="Century Gothic"/>
+                <w:rFonts w:ascii="Tahoma" w:hAnsi="Tahoma"/>
+                <w:b/>
                 <w:spacing w:val="-12"/>
                 <w:sz w:val="20"/>
               </w:rPr>
@@ -2271,7 +2467,8 @@
             </w:r>
             <w:r>
               <w:rPr>
-                <w:rFonts w:ascii="Century Gothic" w:hAnsi="Century Gothic"/>
+                <w:rFonts w:ascii="Tahoma" w:hAnsi="Tahoma"/>
+                <w:b/>
                 <w:spacing w:val="-2"/>
                 <w:sz w:val="20"/>
               </w:rPr>
@@ -2295,6 +2492,11 @@
               </w:rPr>
             </w:pPr>
             <w:r>
+              <w:rPr>
+                <w:rFonts w:ascii="Verdana" w:hAnsi="Verdana"/>
+                <w:b w:val="0"/>
+                <w:sz w:val="22"/>
+              </w:rPr>
               <w:t>{{ ra.test_cycles }}</w:t>
             </w:r>
           </w:p>
@@ -2336,7 +2538,8 @@
             </w:pPr>
             <w:r>
               <w:rPr>
-                <w:rFonts w:ascii="Century Gothic" w:hAnsi="Century Gothic"/>
+                <w:rFonts w:ascii="Tahoma" w:hAnsi="Tahoma"/>
+                <w:b/>
                 <w:w w:val="90"/>
                 <w:sz w:val="20"/>
               </w:rPr>
@@ -2344,7 +2547,8 @@
             </w:r>
             <w:r>
               <w:rPr>
-                <w:rFonts w:ascii="Century Gothic" w:hAnsi="Century Gothic"/>
+                <w:rFonts w:ascii="Tahoma" w:hAnsi="Tahoma"/>
+                <w:b/>
                 <w:spacing w:val="-2"/>
                 <w:sz w:val="20"/>
               </w:rPr>
@@ -2352,7 +2556,8 @@
             </w:r>
             <w:r>
               <w:rPr>
-                <w:rFonts w:ascii="Century Gothic" w:hAnsi="Century Gothic"/>
+                <w:rFonts w:ascii="Tahoma" w:hAnsi="Tahoma"/>
+                <w:b/>
                 <w:w w:val="90"/>
                 <w:sz w:val="20"/>
               </w:rPr>
@@ -2360,7 +2565,8 @@
             </w:r>
             <w:r>
               <w:rPr>
-                <w:rFonts w:ascii="Century Gothic" w:hAnsi="Century Gothic"/>
+                <w:rFonts w:ascii="Tahoma" w:hAnsi="Tahoma"/>
+                <w:b/>
                 <w:spacing w:val="-1"/>
                 <w:sz w:val="20"/>
               </w:rPr>
@@ -2368,7 +2574,8 @@
             </w:r>
             <w:r>
               <w:rPr>
-                <w:rFonts w:ascii="Century Gothic" w:hAnsi="Century Gothic"/>
+                <w:rFonts w:ascii="Tahoma" w:hAnsi="Tahoma"/>
+                <w:b/>
                 <w:w w:val="90"/>
                 <w:sz w:val="20"/>
               </w:rPr>
@@ -2376,7 +2583,8 @@
             </w:r>
             <w:r>
               <w:rPr>
-                <w:rFonts w:ascii="Century Gothic" w:hAnsi="Century Gothic"/>
+                <w:rFonts w:ascii="Tahoma" w:hAnsi="Tahoma"/>
+                <w:b/>
                 <w:spacing w:val="-1"/>
                 <w:sz w:val="20"/>
               </w:rPr>
@@ -2384,7 +2592,8 @@
             </w:r>
             <w:r>
               <w:rPr>
-                <w:rFonts w:ascii="Century Gothic" w:hAnsi="Century Gothic"/>
+                <w:rFonts w:ascii="Tahoma" w:hAnsi="Tahoma"/>
+                <w:b/>
                 <w:w w:val="90"/>
                 <w:sz w:val="20"/>
               </w:rPr>
@@ -2392,7 +2601,8 @@
             </w:r>
             <w:r>
               <w:rPr>
-                <w:rFonts w:ascii="Century Gothic" w:hAnsi="Century Gothic"/>
+                <w:rFonts w:ascii="Tahoma" w:hAnsi="Tahoma"/>
+                <w:b/>
                 <w:spacing w:val="-1"/>
                 <w:sz w:val="20"/>
               </w:rPr>
@@ -2400,7 +2610,8 @@
             </w:r>
             <w:r>
               <w:rPr>
-                <w:rFonts w:ascii="Century Gothic" w:hAnsi="Century Gothic"/>
+                <w:rFonts w:ascii="Tahoma" w:hAnsi="Tahoma"/>
+                <w:b/>
                 <w:spacing w:val="-4"/>
                 <w:w w:val="90"/>
                 <w:sz w:val="20"/>
@@ -2425,6 +2636,11 @@
               </w:rPr>
             </w:pPr>
             <w:r>
+              <w:rPr>
+                <w:rFonts w:ascii="Verdana" w:hAnsi="Verdana"/>
+                <w:b w:val="0"/>
+                <w:sz w:val="22"/>
+              </w:rPr>
               <w:t>{{ ra.total }}</w:t>
             </w:r>
           </w:p>
@@ -2465,7 +2681,8 @@
             </w:pPr>
             <w:r>
               <w:rPr>
-                <w:rFonts w:ascii="Century Gothic" w:hAnsi="Century Gothic"/>
+                <w:rFonts w:ascii="Tahoma" w:hAnsi="Tahoma"/>
+                <w:b/>
                 <w:w w:val="90"/>
                 <w:sz w:val="20"/>
               </w:rPr>
@@ -2473,7 +2690,8 @@
             </w:r>
             <w:r>
               <w:rPr>
-                <w:rFonts w:ascii="Century Gothic" w:hAnsi="Century Gothic"/>
+                <w:rFonts w:ascii="Tahoma" w:hAnsi="Tahoma"/>
+                <w:b/>
                 <w:spacing w:val="-6"/>
                 <w:sz w:val="20"/>
               </w:rPr>
@@ -2481,7 +2699,8 @@
             </w:r>
             <w:r>
               <w:rPr>
-                <w:rFonts w:ascii="Century Gothic" w:hAnsi="Century Gothic"/>
+                <w:rFonts w:ascii="Tahoma" w:hAnsi="Tahoma"/>
+                <w:b/>
                 <w:w w:val="90"/>
                 <w:sz w:val="20"/>
               </w:rPr>
@@ -2489,7 +2708,8 @@
             </w:r>
             <w:r>
               <w:rPr>
-                <w:rFonts w:ascii="Century Gothic" w:hAnsi="Century Gothic"/>
+                <w:rFonts w:ascii="Tahoma" w:hAnsi="Tahoma"/>
+                <w:b/>
                 <w:spacing w:val="-4"/>
                 <w:sz w:val="20"/>
               </w:rPr>
@@ -2497,7 +2717,8 @@
             </w:r>
             <w:r>
               <w:rPr>
-                <w:rFonts w:ascii="Century Gothic" w:hAnsi="Century Gothic"/>
+                <w:rFonts w:ascii="Tahoma" w:hAnsi="Tahoma"/>
+                <w:b/>
                 <w:spacing w:val="-4"/>
                 <w:w w:val="90"/>
                 <w:sz w:val="20"/>
@@ -2521,6 +2742,11 @@
               </w:rPr>
             </w:pPr>
             <w:r>
+              <w:rPr>
+                <w:rFonts w:ascii="Verdana" w:hAnsi="Verdana"/>
+                <w:b w:val="0"/>
+                <w:sz w:val="22"/>
+              </w:rPr>
               <w:t>{{ ra.passed }}</w:t>
             </w:r>
           </w:p>
@@ -2562,7 +2788,8 @@
             </w:pPr>
             <w:r>
               <w:rPr>
-                <w:rFonts w:ascii="Century Gothic" w:hAnsi="Century Gothic"/>
+                <w:rFonts w:ascii="Tahoma" w:hAnsi="Tahoma"/>
+                <w:b/>
                 <w:w w:val="90"/>
                 <w:sz w:val="20"/>
               </w:rPr>
@@ -2570,7 +2797,8 @@
             </w:r>
             <w:r>
               <w:rPr>
-                <w:rFonts w:ascii="Century Gothic" w:hAnsi="Century Gothic"/>
+                <w:rFonts w:ascii="Tahoma" w:hAnsi="Tahoma"/>
+                <w:b/>
                 <w:spacing w:val="-5"/>
                 <w:sz w:val="20"/>
               </w:rPr>
@@ -2578,7 +2806,8 @@
             </w:r>
             <w:r>
               <w:rPr>
-                <w:rFonts w:ascii="Century Gothic" w:hAnsi="Century Gothic"/>
+                <w:rFonts w:ascii="Tahoma" w:hAnsi="Tahoma"/>
+                <w:b/>
                 <w:w w:val="90"/>
                 <w:sz w:val="20"/>
               </w:rPr>
@@ -2586,7 +2815,8 @@
             </w:r>
             <w:r>
               <w:rPr>
-                <w:rFonts w:ascii="Century Gothic" w:hAnsi="Century Gothic"/>
+                <w:rFonts w:ascii="Tahoma" w:hAnsi="Tahoma"/>
+                <w:b/>
                 <w:spacing w:val="-5"/>
                 <w:sz w:val="20"/>
               </w:rPr>
@@ -2594,7 +2824,8 @@
             </w:r>
             <w:r>
               <w:rPr>
-                <w:rFonts w:ascii="Century Gothic" w:hAnsi="Century Gothic"/>
+                <w:rFonts w:ascii="Tahoma" w:hAnsi="Tahoma"/>
+                <w:b/>
                 <w:spacing w:val="-4"/>
                 <w:w w:val="90"/>
                 <w:sz w:val="20"/>
@@ -2619,6 +2850,11 @@
               </w:rPr>
             </w:pPr>
             <w:r>
+              <w:rPr>
+                <w:rFonts w:ascii="Verdana" w:hAnsi="Verdana"/>
+                <w:b w:val="0"/>
+                <w:sz w:val="22"/>
+              </w:rPr>
               <w:t>{{ ra.failed }}</w:t>
             </w:r>
           </w:p>
@@ -2659,7 +2895,8 @@
             </w:pPr>
             <w:r>
               <w:rPr>
-                <w:rFonts w:ascii="Century Gothic" w:hAnsi="Century Gothic"/>
+                <w:rFonts w:ascii="Tahoma" w:hAnsi="Tahoma"/>
+                <w:b/>
                 <w:spacing w:val="-8"/>
                 <w:sz w:val="20"/>
               </w:rPr>
@@ -2667,7 +2904,8 @@
             </w:r>
             <w:r>
               <w:rPr>
-                <w:rFonts w:ascii="Century Gothic" w:hAnsi="Century Gothic"/>
+                <w:rFonts w:ascii="Tahoma" w:hAnsi="Tahoma"/>
+                <w:b/>
                 <w:spacing w:val="-5"/>
                 <w:sz w:val="20"/>
               </w:rPr>
@@ -2675,7 +2913,8 @@
             </w:r>
             <w:r>
               <w:rPr>
-                <w:rFonts w:ascii="Century Gothic" w:hAnsi="Century Gothic"/>
+                <w:rFonts w:ascii="Tahoma" w:hAnsi="Tahoma"/>
+                <w:b/>
                 <w:spacing w:val="-8"/>
                 <w:sz w:val="20"/>
               </w:rPr>
@@ -2683,7 +2922,8 @@
             </w:r>
             <w:r>
               <w:rPr>
-                <w:rFonts w:ascii="Century Gothic" w:hAnsi="Century Gothic"/>
+                <w:rFonts w:ascii="Tahoma" w:hAnsi="Tahoma"/>
+                <w:b/>
                 <w:spacing w:val="-3"/>
                 <w:sz w:val="20"/>
               </w:rPr>
@@ -2691,7 +2931,8 @@
             </w:r>
             <w:r>
               <w:rPr>
-                <w:rFonts w:ascii="Century Gothic" w:hAnsi="Century Gothic"/>
+                <w:rFonts w:ascii="Tahoma" w:hAnsi="Tahoma"/>
+                <w:b/>
                 <w:spacing w:val="-8"/>
                 <w:sz w:val="20"/>
               </w:rPr>
@@ -2714,6 +2955,11 @@
               </w:rPr>
             </w:pPr>
             <w:r>
+              <w:rPr>
+                <w:rFonts w:ascii="Verdana" w:hAnsi="Verdana"/>
+                <w:b w:val="0"/>
+                <w:sz w:val="22"/>
+              </w:rPr>
               <w:t>{{ ra.unexecuted }}</w:t>
             </w:r>
           </w:p>
@@ -2754,7 +3000,8 @@
             </w:pPr>
             <w:r>
               <w:rPr>
-                <w:rFonts w:ascii="Century Gothic" w:hAnsi="Century Gothic"/>
+                <w:rFonts w:ascii="Tahoma" w:hAnsi="Tahoma"/>
+                <w:b/>
                 <w:spacing w:val="-8"/>
                 <w:sz w:val="20"/>
               </w:rPr>
@@ -2762,7 +3009,8 @@
             </w:r>
             <w:r>
               <w:rPr>
-                <w:rFonts w:ascii="Century Gothic" w:hAnsi="Century Gothic"/>
+                <w:rFonts w:ascii="Tahoma" w:hAnsi="Tahoma"/>
+                <w:b/>
                 <w:spacing w:val="-10"/>
                 <w:sz w:val="20"/>
               </w:rPr>
@@ -2770,7 +3018,8 @@
             </w:r>
             <w:r>
               <w:rPr>
-                <w:rFonts w:ascii="Century Gothic" w:hAnsi="Century Gothic"/>
+                <w:rFonts w:ascii="Tahoma" w:hAnsi="Tahoma"/>
+                <w:b/>
                 <w:spacing w:val="-8"/>
                 <w:sz w:val="20"/>
               </w:rPr>
@@ -2778,7 +3027,8 @@
             </w:r>
             <w:r>
               <w:rPr>
-                <w:rFonts w:ascii="Century Gothic" w:hAnsi="Century Gothic"/>
+                <w:rFonts w:ascii="Tahoma" w:hAnsi="Tahoma"/>
+                <w:b/>
                 <w:spacing w:val="-9"/>
                 <w:sz w:val="20"/>
               </w:rPr>
@@ -2786,7 +3036,8 @@
             </w:r>
             <w:r>
               <w:rPr>
-                <w:rFonts w:ascii="Century Gothic" w:hAnsi="Century Gothic"/>
+                <w:rFonts w:ascii="Tahoma" w:hAnsi="Tahoma"/>
+                <w:b/>
                 <w:spacing w:val="-8"/>
                 <w:sz w:val="20"/>
               </w:rPr>
@@ -2809,6 +3060,11 @@
               </w:rPr>
             </w:pPr>
             <w:r>
+              <w:rPr>
+                <w:rFonts w:ascii="Verdana" w:hAnsi="Verdana"/>
+                <w:b w:val="0"/>
+                <w:sz w:val="22"/>
+              </w:rPr>
               <w:t>{{ ra.suspended }}</w:t>
             </w:r>
           </w:p>
@@ -2850,7 +3106,8 @@
             </w:pPr>
             <w:r>
               <w:rPr>
-                <w:rFonts w:ascii="Century Gothic" w:hAnsi="Century Gothic"/>
+                <w:rFonts w:ascii="Tahoma" w:hAnsi="Tahoma"/>
+                <w:b/>
                 <w:spacing w:val="-6"/>
                 <w:sz w:val="20"/>
               </w:rPr>
@@ -2858,7 +3115,8 @@
             </w:r>
             <w:r>
               <w:rPr>
-                <w:rFonts w:ascii="Century Gothic" w:hAnsi="Century Gothic"/>
+                <w:rFonts w:ascii="Tahoma" w:hAnsi="Tahoma"/>
+                <w:b/>
                 <w:spacing w:val="-13"/>
                 <w:sz w:val="20"/>
               </w:rPr>
@@ -2866,7 +3124,8 @@
             </w:r>
             <w:r>
               <w:rPr>
-                <w:rFonts w:ascii="Century Gothic" w:hAnsi="Century Gothic"/>
+                <w:rFonts w:ascii="Tahoma" w:hAnsi="Tahoma"/>
+                <w:b/>
                 <w:spacing w:val="-6"/>
                 <w:sz w:val="20"/>
               </w:rPr>
@@ -2874,7 +3133,8 @@
             </w:r>
             <w:r>
               <w:rPr>
-                <w:rFonts w:ascii="Century Gothic" w:hAnsi="Century Gothic"/>
+                <w:rFonts w:ascii="Tahoma" w:hAnsi="Tahoma"/>
+                <w:b/>
                 <w:spacing w:val="-11"/>
                 <w:sz w:val="20"/>
               </w:rPr>
@@ -2882,7 +3142,8 @@
             </w:r>
             <w:r>
               <w:rPr>
-                <w:rFonts w:ascii="Century Gothic" w:hAnsi="Century Gothic"/>
+                <w:rFonts w:ascii="Tahoma" w:hAnsi="Tahoma"/>
+                <w:b/>
                 <w:spacing w:val="-6"/>
                 <w:sz w:val="20"/>
               </w:rPr>
@@ -2906,6 +3167,11 @@
               </w:rPr>
             </w:pPr>
             <w:r>
+              <w:rPr>
+                <w:rFonts w:ascii="Verdana" w:hAnsi="Verdana"/>
+                <w:b w:val="0"/>
+                <w:sz w:val="22"/>
+              </w:rPr>
               <w:t>{{ ra.modification }}</w:t>
             </w:r>
           </w:p>
@@ -2923,7 +3189,7 @@
         <w:sectPr>
           <w:type w:val="continuous"/>
           <w:pgSz w:w="12240" w:h="15840"/>
-          <w:pgMar w:top="1420" w:right="0" w:bottom="1251" w:left="360" w:header="0" w:footer="388" w:gutter="0"/>
+          <w:pgMar w:top="1420" w:right="0" w:bottom="580" w:left="360" w:header="0" w:footer="388" w:gutter="0"/>
           <w:cols w:space="720" w:num="1"/>
         </w:sectPr>
       </w:pPr>
@@ -2989,7 +3255,8 @@
             </w:pPr>
             <w:r>
               <w:rPr>
-                <w:rFonts w:ascii="Century Gothic" w:hAnsi="Century Gothic"/>
+                <w:rFonts w:ascii="Tahoma" w:hAnsi="Tahoma"/>
+                <w:b/>
                 <w:spacing w:val="-8"/>
                 <w:sz w:val="20"/>
               </w:rPr>
@@ -2997,7 +3264,8 @@
             </w:r>
             <w:r>
               <w:rPr>
-                <w:rFonts w:ascii="Century Gothic" w:hAnsi="Century Gothic"/>
+                <w:rFonts w:ascii="Tahoma" w:hAnsi="Tahoma"/>
+                <w:b/>
                 <w:spacing w:val="7"/>
                 <w:sz w:val="20"/>
               </w:rPr>
@@ -3005,7 +3273,8 @@
             </w:r>
             <w:r>
               <w:rPr>
-                <w:rFonts w:ascii="Century Gothic" w:hAnsi="Century Gothic"/>
+                <w:rFonts w:ascii="Tahoma" w:hAnsi="Tahoma"/>
+                <w:b/>
                 <w:spacing w:val="-8"/>
                 <w:sz w:val="20"/>
               </w:rPr>
@@ -3013,7 +3282,8 @@
             </w:r>
             <w:r>
               <w:rPr>
-                <w:rFonts w:ascii="Century Gothic" w:hAnsi="Century Gothic"/>
+                <w:rFonts w:ascii="Tahoma" w:hAnsi="Tahoma"/>
+                <w:b/>
                 <w:spacing w:val="8"/>
                 <w:sz w:val="20"/>
               </w:rPr>
@@ -3021,7 +3291,8 @@
             </w:r>
             <w:r>
               <w:rPr>
-                <w:rFonts w:ascii="Century Gothic" w:hAnsi="Century Gothic"/>
+                <w:rFonts w:ascii="Tahoma" w:hAnsi="Tahoma"/>
+                <w:b/>
                 <w:spacing w:val="-8"/>
                 <w:sz w:val="20"/>
               </w:rPr>
@@ -3045,6 +3316,11 @@
               </w:rPr>
             </w:pPr>
             <w:r>
+              <w:rPr>
+                <w:rFonts w:ascii="Verdana" w:hAnsi="Verdana"/>
+                <w:b w:val="0"/>
+                <w:sz w:val="22"/>
+              </w:rPr>
               <w:t>{{ automation_ratio }}</w:t>
             </w:r>
           </w:p>
@@ -3088,7 +3364,7 @@
             </w:pPr>
             <w:r>
               <w:rPr>
-                <w:rFonts w:ascii="Century Gothic" w:hAnsi="Century Gothic"/>
+                <w:rFonts w:ascii="Tahoma" w:hAnsi="Tahoma"/>
                 <w:b/>
                 <w:color w:val="FFFFFF"/>
                 <w:w w:val="90"/>
@@ -3098,7 +3374,7 @@
             </w:r>
             <w:r>
               <w:rPr>
-                <w:rFonts w:ascii="Century Gothic" w:hAnsi="Century Gothic"/>
+                <w:rFonts w:ascii="Tahoma" w:hAnsi="Tahoma"/>
                 <w:b/>
                 <w:color w:val="FFFFFF"/>
                 <w:spacing w:val="3"/>
@@ -3108,7 +3384,7 @@
             </w:r>
             <w:r>
               <w:rPr>
-                <w:rFonts w:ascii="Century Gothic" w:hAnsi="Century Gothic"/>
+                <w:rFonts w:ascii="Tahoma" w:hAnsi="Tahoma"/>
                 <w:b/>
                 <w:color w:val="FFFFFF"/>
                 <w:spacing w:val="-2"/>
@@ -3169,7 +3445,8 @@
             </w:pPr>
             <w:r>
               <w:rPr>
-                <w:rFonts w:ascii="Century Gothic" w:hAnsi="Century Gothic"/>
+                <w:rFonts w:ascii="Tahoma" w:hAnsi="Tahoma"/>
+                <w:b/>
                 <w:w w:val="90"/>
                 <w:sz w:val="20"/>
               </w:rPr>
@@ -3177,7 +3454,8 @@
             </w:r>
             <w:r>
               <w:rPr>
-                <w:rFonts w:ascii="Century Gothic" w:hAnsi="Century Gothic"/>
+                <w:rFonts w:ascii="Tahoma" w:hAnsi="Tahoma"/>
+                <w:b/>
                 <w:spacing w:val="3"/>
                 <w:sz w:val="20"/>
               </w:rPr>
@@ -3185,7 +3463,8 @@
             </w:r>
             <w:r>
               <w:rPr>
-                <w:rFonts w:ascii="Century Gothic" w:hAnsi="Century Gothic"/>
+                <w:rFonts w:ascii="Tahoma" w:hAnsi="Tahoma"/>
+                <w:b/>
                 <w:w w:val="90"/>
                 <w:sz w:val="20"/>
               </w:rPr>
@@ -3193,7 +3472,8 @@
             </w:r>
             <w:r>
               <w:rPr>
-                <w:rFonts w:ascii="Century Gothic" w:hAnsi="Century Gothic"/>
+                <w:rFonts w:ascii="Tahoma" w:hAnsi="Tahoma"/>
+                <w:b/>
                 <w:spacing w:val="2"/>
                 <w:sz w:val="20"/>
               </w:rPr>
@@ -3201,7 +3481,8 @@
             </w:r>
             <w:r>
               <w:rPr>
-                <w:rFonts w:ascii="Century Gothic" w:hAnsi="Century Gothic"/>
+                <w:rFonts w:ascii="Tahoma" w:hAnsi="Tahoma"/>
+                <w:b/>
                 <w:w w:val="90"/>
                 <w:sz w:val="20"/>
               </w:rPr>
@@ -3209,7 +3490,8 @@
             </w:r>
             <w:r>
               <w:rPr>
-                <w:rFonts w:ascii="Century Gothic" w:hAnsi="Century Gothic"/>
+                <w:rFonts w:ascii="Tahoma" w:hAnsi="Tahoma"/>
+                <w:b/>
                 <w:spacing w:val="3"/>
                 <w:sz w:val="20"/>
               </w:rPr>
@@ -3217,7 +3499,8 @@
             </w:r>
             <w:r>
               <w:rPr>
-                <w:rFonts w:ascii="Century Gothic" w:hAnsi="Century Gothic"/>
+                <w:rFonts w:ascii="Tahoma" w:hAnsi="Tahoma"/>
+                <w:b/>
                 <w:spacing w:val="-2"/>
                 <w:w w:val="90"/>
                 <w:sz w:val="20"/>
@@ -3240,6 +3523,11 @@
               </w:rPr>
             </w:pPr>
             <w:r>
+              <w:rPr>
+                <w:rFonts w:ascii="Verdana" w:hAnsi="Verdana"/>
+                <w:b w:val="0"/>
+                <w:sz w:val="22"/>
+              </w:rPr>
               <w:t>{{ bugs.raised }}</w:t>
             </w:r>
           </w:p>
@@ -3280,7 +3568,8 @@
             </w:pPr>
             <w:r>
               <w:rPr>
-                <w:rFonts w:ascii="Century Gothic" w:hAnsi="Century Gothic"/>
+                <w:rFonts w:ascii="Tahoma" w:hAnsi="Tahoma"/>
+                <w:b/>
                 <w:spacing w:val="-6"/>
                 <w:sz w:val="20"/>
               </w:rPr>
@@ -3288,7 +3577,8 @@
             </w:r>
             <w:r>
               <w:rPr>
-                <w:rFonts w:ascii="Century Gothic" w:hAnsi="Century Gothic"/>
+                <w:rFonts w:ascii="Tahoma" w:hAnsi="Tahoma"/>
+                <w:b/>
                 <w:spacing w:val="-13"/>
                 <w:sz w:val="20"/>
               </w:rPr>
@@ -3296,7 +3586,8 @@
             </w:r>
             <w:r>
               <w:rPr>
-                <w:rFonts w:ascii="Century Gothic" w:hAnsi="Century Gothic"/>
+                <w:rFonts w:ascii="Tahoma" w:hAnsi="Tahoma"/>
+                <w:b/>
                 <w:spacing w:val="-6"/>
                 <w:sz w:val="20"/>
               </w:rPr>
@@ -3304,7 +3595,8 @@
             </w:r>
             <w:r>
               <w:rPr>
-                <w:rFonts w:ascii="Century Gothic" w:hAnsi="Century Gothic"/>
+                <w:rFonts w:ascii="Tahoma" w:hAnsi="Tahoma"/>
+                <w:b/>
                 <w:spacing w:val="-14"/>
                 <w:sz w:val="20"/>
               </w:rPr>
@@ -3312,7 +3604,8 @@
             </w:r>
             <w:r>
               <w:rPr>
-                <w:rFonts w:ascii="Century Gothic" w:hAnsi="Century Gothic"/>
+                <w:rFonts w:ascii="Tahoma" w:hAnsi="Tahoma"/>
+                <w:b/>
                 <w:spacing w:val="-6"/>
                 <w:sz w:val="20"/>
               </w:rPr>
@@ -3320,7 +3613,8 @@
             </w:r>
             <w:r>
               <w:rPr>
-                <w:rFonts w:ascii="Century Gothic" w:hAnsi="Century Gothic"/>
+                <w:rFonts w:ascii="Tahoma" w:hAnsi="Tahoma"/>
+                <w:b/>
                 <w:spacing w:val="-14"/>
                 <w:sz w:val="20"/>
               </w:rPr>
@@ -3328,7 +3622,8 @@
             </w:r>
             <w:r>
               <w:rPr>
-                <w:rFonts w:ascii="Century Gothic" w:hAnsi="Century Gothic"/>
+                <w:rFonts w:ascii="Tahoma" w:hAnsi="Tahoma"/>
+                <w:b/>
                 <w:spacing w:val="-6"/>
                 <w:sz w:val="20"/>
               </w:rPr>
@@ -3350,6 +3645,11 @@
               </w:rPr>
             </w:pPr>
             <w:r>
+              <w:rPr>
+                <w:rFonts w:ascii="Verdana" w:hAnsi="Verdana"/>
+                <w:b w:val="0"/>
+                <w:sz w:val="22"/>
+              </w:rPr>
               <w:t>{{ bugs.fixed_retested }}</w:t>
             </w:r>
           </w:p>
@@ -3391,14 +3691,16 @@
             </w:pPr>
             <w:r>
               <w:rPr>
-                <w:rFonts w:ascii="Century Gothic" w:hAnsi="Century Gothic"/>
+                <w:rFonts w:ascii="Tahoma" w:hAnsi="Tahoma"/>
+                <w:b/>
                 <w:sz w:val="20"/>
               </w:rPr>
               <w:t>Opened</w:t>
             </w:r>
             <w:r>
               <w:rPr>
-                <w:rFonts w:ascii="Century Gothic" w:hAnsi="Century Gothic"/>
+                <w:rFonts w:ascii="Tahoma" w:hAnsi="Tahoma"/>
+                <w:b/>
                 <w:spacing w:val="35"/>
                 <w:sz w:val="20"/>
               </w:rPr>
@@ -3406,7 +3708,8 @@
             </w:r>
             <w:r>
               <w:rPr>
-                <w:rFonts w:ascii="Century Gothic" w:hAnsi="Century Gothic"/>
+                <w:rFonts w:ascii="Tahoma" w:hAnsi="Tahoma"/>
+                <w:b/>
                 <w:spacing w:val="-4"/>
                 <w:sz w:val="20"/>
               </w:rPr>
@@ -3429,6 +3732,11 @@
               </w:rPr>
             </w:pPr>
             <w:r>
+              <w:rPr>
+                <w:rFonts w:ascii="Verdana" w:hAnsi="Verdana"/>
+                <w:b w:val="0"/>
+                <w:sz w:val="22"/>
+              </w:rPr>
               <w:t>{{ bugs.open }}</w:t>
             </w:r>
           </w:p>
@@ -3646,7 +3954,7 @@
             </w:pPr>
             <w:r>
               <w:rPr>
-                <w:rFonts w:ascii="Century Gothic" w:hAnsi="Century Gothic"/>
+                <w:rFonts w:ascii="Tahoma" w:hAnsi="Tahoma"/>
                 <w:b/>
                 <w:spacing w:val="-6"/>
                 <w:sz w:val="20"/>
@@ -3673,7 +3981,7 @@
             </w:pPr>
             <w:r>
               <w:rPr>
-                <w:rFonts w:ascii="Century Gothic" w:hAnsi="Century Gothic"/>
+                <w:rFonts w:ascii="Tahoma" w:hAnsi="Tahoma"/>
                 <w:b/>
                 <w:spacing w:val="-2"/>
                 <w:w w:val="85"/>
@@ -3683,7 +3991,7 @@
             </w:r>
             <w:r>
               <w:rPr>
-                <w:rFonts w:ascii="Century Gothic" w:hAnsi="Century Gothic"/>
+                <w:rFonts w:ascii="Tahoma" w:hAnsi="Tahoma"/>
                 <w:b/>
                 <w:spacing w:val="-4"/>
                 <w:sz w:val="20"/>
@@ -3710,7 +4018,7 @@
             </w:pPr>
             <w:r>
               <w:rPr>
-                <w:rFonts w:ascii="Century Gothic" w:hAnsi="Century Gothic"/>
+                <w:rFonts w:ascii="Tahoma" w:hAnsi="Tahoma"/>
                 <w:b/>
                 <w:spacing w:val="-2"/>
                 <w:sz w:val="20"/>
@@ -3737,7 +4045,7 @@
             </w:pPr>
             <w:r>
               <w:rPr>
-                <w:rFonts w:ascii="Century Gothic" w:hAnsi="Century Gothic"/>
+                <w:rFonts w:ascii="Tahoma" w:hAnsi="Tahoma"/>
                 <w:b/>
                 <w:spacing w:val="-2"/>
                 <w:w w:val="95"/>
@@ -3765,7 +4073,7 @@
             </w:pPr>
             <w:r>
               <w:rPr>
-                <w:rFonts w:ascii="Century Gothic" w:hAnsi="Century Gothic"/>
+                <w:rFonts w:ascii="Tahoma" w:hAnsi="Tahoma"/>
                 <w:b/>
                 <w:w w:val="80"/>
                 <w:sz w:val="20"/>
@@ -3774,7 +4082,7 @@
             </w:r>
             <w:r>
               <w:rPr>
-                <w:rFonts w:ascii="Century Gothic" w:hAnsi="Century Gothic"/>
+                <w:rFonts w:ascii="Tahoma" w:hAnsi="Tahoma"/>
                 <w:b/>
                 <w:spacing w:val="-2"/>
                 <w:w w:val="80"/>
@@ -3784,7 +4092,7 @@
             </w:r>
             <w:r>
               <w:rPr>
-                <w:rFonts w:ascii="Century Gothic" w:hAnsi="Century Gothic"/>
+                <w:rFonts w:ascii="Tahoma" w:hAnsi="Tahoma"/>
                 <w:b/>
                 <w:spacing w:val="-2"/>
                 <w:w w:val="95"/>
@@ -3831,6 +4139,11 @@
               </w:rPr>
             </w:pPr>
             <w:r>
+              <w:rPr>
+                <w:rFonts w:ascii="Verdana" w:hAnsi="Verdana"/>
+                <w:b w:val="0"/>
+                <w:sz w:val="22"/>
+              </w:rPr>
               <w:t>{%tr for e in exceptions %}</w:t>
             </w:r>
           </w:p>
@@ -3849,7 +4162,13 @@
                 <w:sz w:val="20"/>
               </w:rPr>
             </w:pPr>
-            <w:r/>
+            <w:r>
+              <w:rPr>
+                <w:rFonts w:ascii="Tahoma" w:hAnsi="Tahoma"/>
+                <w:b/>
+                <w:sz w:val="20"/>
+              </w:rPr>
+            </w:r>
           </w:p>
         </w:tc>
         <w:tc>
@@ -3866,7 +4185,13 @@
                 <w:sz w:val="20"/>
               </w:rPr>
             </w:pPr>
-            <w:r/>
+            <w:r>
+              <w:rPr>
+                <w:rFonts w:ascii="Tahoma" w:hAnsi="Tahoma"/>
+                <w:b/>
+                <w:sz w:val="20"/>
+              </w:rPr>
+            </w:r>
           </w:p>
         </w:tc>
         <w:tc>
@@ -3883,7 +4208,13 @@
                 <w:sz w:val="20"/>
               </w:rPr>
             </w:pPr>
-            <w:r/>
+            <w:r>
+              <w:rPr>
+                <w:rFonts w:ascii="Tahoma" w:hAnsi="Tahoma"/>
+                <w:b/>
+                <w:sz w:val="20"/>
+              </w:rPr>
+            </w:r>
           </w:p>
         </w:tc>
         <w:tc>
@@ -3900,7 +4231,13 @@
                 <w:sz w:val="20"/>
               </w:rPr>
             </w:pPr>
-            <w:r/>
+            <w:r>
+              <w:rPr>
+                <w:rFonts w:ascii="Tahoma" w:hAnsi="Tahoma"/>
+                <w:b/>
+                <w:sz w:val="20"/>
+              </w:rPr>
+            </w:r>
           </w:p>
         </w:tc>
       </w:tr>
@@ -3940,6 +4277,11 @@
               </w:rPr>
             </w:pPr>
             <w:r>
+              <w:rPr>
+                <w:rFonts w:ascii="Verdana" w:hAnsi="Verdana"/>
+                <w:b w:val="0"/>
+                <w:sz w:val="22"/>
+              </w:rPr>
               <w:t>{{ e.id }}</w:t>
             </w:r>
           </w:p>
@@ -3959,6 +4301,11 @@
               </w:rPr>
             </w:pPr>
             <w:r>
+              <w:rPr>
+                <w:rFonts w:ascii="Verdana" w:hAnsi="Verdana"/>
+                <w:b w:val="0"/>
+                <w:sz w:val="22"/>
+              </w:rPr>
               <w:t>{{ e.status_type }}</w:t>
             </w:r>
           </w:p>
@@ -3978,6 +4325,11 @@
               </w:rPr>
             </w:pPr>
             <w:r>
+              <w:rPr>
+                <w:rFonts w:ascii="Verdana" w:hAnsi="Verdana"/>
+                <w:b w:val="0"/>
+                <w:sz w:val="22"/>
+              </w:rPr>
               <w:t>{{ e.description }}</w:t>
             </w:r>
           </w:p>
@@ -3997,6 +4349,11 @@
               </w:rPr>
             </w:pPr>
             <w:r>
+              <w:rPr>
+                <w:rFonts w:ascii="Verdana" w:hAnsi="Verdana"/>
+                <w:b w:val="0"/>
+                <w:sz w:val="22"/>
+              </w:rPr>
               <w:t>{{ e.severity }}</w:t>
             </w:r>
           </w:p>
@@ -4016,6 +4373,11 @@
               </w:rPr>
             </w:pPr>
             <w:r>
+              <w:rPr>
+                <w:rFonts w:ascii="Verdana" w:hAnsi="Verdana"/>
+                <w:b w:val="0"/>
+                <w:sz w:val="22"/>
+              </w:rPr>
               <w:t>{{ e.risk }}</w:t>
             </w:r>
           </w:p>
@@ -4057,6 +4419,11 @@
               </w:rPr>
             </w:pPr>
             <w:r>
+              <w:rPr>
+                <w:rFonts w:ascii="Verdana" w:hAnsi="Verdana"/>
+                <w:b w:val="0"/>
+                <w:sz w:val="22"/>
+              </w:rPr>
               <w:t>{%tr endfor %}</w:t>
             </w:r>
           </w:p>
@@ -4075,7 +4442,13 @@
                 <w:sz w:val="20"/>
               </w:rPr>
             </w:pPr>
-            <w:r/>
+            <w:r>
+              <w:rPr>
+                <w:rFonts w:ascii="Tahoma" w:hAnsi="Tahoma"/>
+                <w:b/>
+                <w:sz w:val="20"/>
+              </w:rPr>
+            </w:r>
           </w:p>
         </w:tc>
         <w:tc>
@@ -4092,7 +4465,13 @@
                 <w:sz w:val="20"/>
               </w:rPr>
             </w:pPr>
-            <w:r/>
+            <w:r>
+              <w:rPr>
+                <w:rFonts w:ascii="Tahoma" w:hAnsi="Tahoma"/>
+                <w:b/>
+                <w:sz w:val="20"/>
+              </w:rPr>
+            </w:r>
           </w:p>
         </w:tc>
         <w:tc>
@@ -4109,7 +4488,13 @@
                 <w:sz w:val="20"/>
               </w:rPr>
             </w:pPr>
-            <w:r/>
+            <w:r>
+              <w:rPr>
+                <w:rFonts w:ascii="Tahoma" w:hAnsi="Tahoma"/>
+                <w:b/>
+                <w:sz w:val="20"/>
+              </w:rPr>
+            </w:r>
           </w:p>
         </w:tc>
         <w:tc>
@@ -4126,7 +4511,13 @@
                 <w:sz w:val="20"/>
               </w:rPr>
             </w:pPr>
-            <w:r/>
+            <w:r>
+              <w:rPr>
+                <w:rFonts w:ascii="Tahoma" w:hAnsi="Tahoma"/>
+                <w:b/>
+                <w:sz w:val="20"/>
+              </w:rPr>
+            </w:r>
           </w:p>
         </w:tc>
       </w:tr>
@@ -4175,15 +4566,91 @@
         <w:t>Comments/Observation</w:t>
       </w:r>
     </w:p>
+    <w:tbl>
+      <w:tblPr>
+        <w:tblW w:w="9835" w:type="dxa"/>
+        <w:tblBorders>
+          <w:top w:val="single" w:sz="6" w:space="0" w:color="000000"/>
+          <w:left w:val="single" w:sz="6" w:space="0" w:color="000000"/>
+          <w:bottom w:val="single" w:sz="6" w:space="0" w:color="000000"/>
+          <w:right w:val="single" w:sz="6" w:space="0" w:color="000000"/>
+          <w:insideH w:val="single" w:sz="6" w:space="0" w:color="000000"/>
+          <w:insideV w:val="single" w:sz="6" w:space="0" w:color="000000"/>
+        </w:tblBorders>
+      </w:tblPr>
+      <w:tblGrid>
+        <w:gridCol w:w="9835"/>
+      </w:tblGrid>
+      <w:tr>
+        <w:trPr>
+          <w:trHeight w:val="1800" w:hRule="atLeast"/>
+        </w:trPr>
+        <w:tc>
+          <w:tcPr>
+            <w:tcW w:w="9835" w:type="dxa"/>
+          </w:tcPr>
+          <w:p>
+            <w:pPr>
+              <w:pStyle w:val="5"/>
+              <w:spacing w:before="5"/>
+              <w:rPr>
+                <w:rFonts w:ascii="Century Gothic" w:hAnsi="Century Gothic"/>
+                <w:b/>
+                <w:sz w:val="14"/>
+              </w:rPr>
+            </w:pPr>
+            <w:r>
+              <w:rPr>
+                <w:rFonts w:ascii="Verdana" w:hAnsi="Verdana"/>
+                <w:b w:val="0"/>
+                <w:sz w:val="22"/>
+              </w:rPr>
+              <w:t>{%p for p in comments %}</w:t>
+            </w:r>
+          </w:p>
+          <w:p>
+            <w:pPr>
+              <w:pStyle w:val="5"/>
+              <w:spacing w:before="5"/>
+              <w:rPr>
+                <w:rFonts w:ascii="Century Gothic" w:hAnsi="Century Gothic"/>
+                <w:b/>
+                <w:sz w:val="14"/>
+              </w:rPr>
+            </w:pPr>
+            <w:r>
+              <w:rPr>
+                <w:rFonts w:ascii="Verdana" w:hAnsi="Verdana"/>
+                <w:b w:val="0"/>
+                <w:sz w:val="22"/>
+              </w:rPr>
+              <w:t>{{ p }}</w:t>
+            </w:r>
+          </w:p>
+          <w:p>
+            <w:pPr>
+              <w:pStyle w:val="5"/>
+              <w:spacing w:before="5"/>
+              <w:rPr>
+                <w:rFonts w:ascii="Century Gothic" w:hAnsi="Century Gothic"/>
+                <w:b/>
+                <w:sz w:val="14"/>
+              </w:rPr>
+            </w:pPr>
+            <w:r>
+              <w:rPr>
+                <w:rFonts w:ascii="Verdana" w:hAnsi="Verdana"/>
+                <w:b w:val="0"/>
+                <w:sz w:val="22"/>
+              </w:rPr>
+              <w:t>{%p endfor %}</w:t>
+            </w:r>
+          </w:p>
+        </w:tc>
+      </w:tr>
+    </w:tbl>
     <w:p>
       <w:pPr>
-        <w:pStyle w:val="5"/>
-        <w:spacing w:before="5"/>
-        <w:rPr>
-          <w:rFonts w:ascii="Century Gothic" w:hAnsi="Century Gothic"/>
-          <w:b/>
-          <w:sz w:val="14"/>
-        </w:rPr>
         <w:sectPr>
           <w:type w:val="continuous"/>
           <w:pgSz w:w="12240" w:h="15840"/>
@@ -4191,49 +4658,6 @@
           <w:cols w:space="720" w:num="1"/>
         </w:sectPr>
       </w:pPr>
-      <w:r>
-        <w:t>{%p for p in comments %}</w:t>
-      </w:r>
-    </w:p>
-    <w:p>
-      <w:pPr>
-        <w:pStyle w:val="5"/>
-        <w:spacing w:before="5"/>
-        <w:rPr>
-          <w:rFonts w:ascii="Century Gothic" w:hAnsi="Century Gothic"/>
-          <w:b/>
-          <w:sz w:val="14"/>
-        </w:rPr>
-        <w:sectPr>
-          <w:type w:val="continuous"/>
-          <w:pgSz w:w="12240" w:h="15840"/>
-          <w:pgMar w:top="1420" w:right="0" w:bottom="580" w:left="360" w:header="0" w:footer="388" w:gutter="0"/>
-          <w:cols w:space="720" w:num="1"/>
-        </w:sectPr>
-      </w:pPr>
-      <w:r>
-        <w:t>{{ p }}</w:t>
-      </w:r>
-    </w:p>
-    <w:p>
-      <w:pPr>
-        <w:pStyle w:val="5"/>
-        <w:spacing w:before="5"/>
-        <w:rPr>
-          <w:rFonts w:ascii="Century Gothic" w:hAnsi="Century Gothic"/>
-          <w:b/>
-          <w:sz w:val="14"/>
-        </w:rPr>
-        <w:sectPr>
-          <w:type w:val="continuous"/>
-          <w:pgSz w:w="12240" w:h="15840"/>
-          <w:pgMar w:top="1420" w:right="0" w:bottom="580" w:left="360" w:header="0" w:footer="388" w:gutter="0"/>
-          <w:cols w:space="720" w:num="1"/>
-        </w:sectPr>
-      </w:pPr>
-      <w:r>
-        <w:t>{%p endfor %}</w:t>
-      </w:r>
     </w:p>
     <w:p>
       <w:pPr>
@@ -4377,7 +4801,7 @@
             </w:pPr>
             <w:r>
               <w:rPr>
-                <w:rFonts w:ascii="Century Gothic" w:hAnsi="Century Gothic"/>
+                <w:rFonts w:ascii="Tahoma" w:hAnsi="Tahoma"/>
                 <w:b/>
                 <w:color w:val="FFFFFF"/>
                 <w:spacing w:val="-2"/>
@@ -4405,7 +4829,7 @@
             </w:pPr>
             <w:r>
               <w:rPr>
-                <w:rFonts w:ascii="Century Gothic" w:hAnsi="Century Gothic"/>
+                <w:rFonts w:ascii="Tahoma" w:hAnsi="Tahoma"/>
                 <w:b/>
                 <w:color w:val="FFFFFF"/>
                 <w:spacing w:val="-4"/>
@@ -4434,7 +4858,7 @@
             </w:pPr>
             <w:r>
               <w:rPr>
-                <w:rFonts w:ascii="Century Gothic" w:hAnsi="Century Gothic"/>
+                <w:rFonts w:ascii="Tahoma" w:hAnsi="Tahoma"/>
                 <w:b/>
                 <w:color w:val="FFFFFF"/>
                 <w:w w:val="85"/>
@@ -4444,7 +4868,7 @@
             </w:r>
             <w:r>
               <w:rPr>
-                <w:rFonts w:ascii="Century Gothic" w:hAnsi="Century Gothic"/>
+                <w:rFonts w:ascii="Tahoma" w:hAnsi="Tahoma"/>
                 <w:b/>
                 <w:color w:val="FFFFFF"/>
                 <w:spacing w:val="-2"/>
@@ -4455,7 +4879,7 @@
             </w:r>
             <w:r>
               <w:rPr>
-                <w:rFonts w:ascii="Century Gothic" w:hAnsi="Century Gothic"/>
+                <w:rFonts w:ascii="Tahoma" w:hAnsi="Tahoma"/>
                 <w:b/>
                 <w:color w:val="FFFFFF"/>
                 <w:spacing w:val="-5"/>
@@ -4484,7 +4908,7 @@
             </w:pPr>
             <w:r>
               <w:rPr>
-                <w:rFonts w:ascii="Century Gothic" w:hAnsi="Century Gothic"/>
+                <w:rFonts w:ascii="Tahoma" w:hAnsi="Tahoma"/>
                 <w:b/>
                 <w:color w:val="FFFFFF"/>
                 <w:spacing w:val="-2"/>
@@ -4512,7 +4936,7 @@
             </w:pPr>
             <w:r>
               <w:rPr>
-                <w:rFonts w:ascii="Century Gothic" w:hAnsi="Century Gothic"/>
+                <w:rFonts w:ascii="Tahoma" w:hAnsi="Tahoma"/>
                 <w:b/>
                 <w:color w:val="FFFFFF"/>
                 <w:spacing w:val="-4"/>
@@ -4559,6 +4983,11 @@
               </w:rPr>
             </w:pPr>
             <w:r>
+              <w:rPr>
+                <w:rFonts w:ascii="Verdana" w:hAnsi="Verdana"/>
+                <w:b w:val="0"/>
+                <w:sz w:val="22"/>
+              </w:rPr>
               <w:t>{%tr for a in approvals %}</w:t>
             </w:r>
           </w:p>
@@ -4577,7 +5006,13 @@
                 <w:sz w:val="20"/>
               </w:rPr>
             </w:pPr>
-            <w:r/>
+            <w:r>
+              <w:rPr>
+                <w:rFonts w:ascii="Tahoma" w:hAnsi="Tahoma"/>
+                <w:b/>
+                <w:sz w:val="20"/>
+              </w:rPr>
+            </w:r>
           </w:p>
         </w:tc>
         <w:tc>
@@ -4595,7 +5030,13 @@
                 <w:sz w:val="20"/>
               </w:rPr>
             </w:pPr>
-            <w:r/>
+            <w:r>
+              <w:rPr>
+                <w:rFonts w:ascii="Tahoma" w:hAnsi="Tahoma"/>
+                <w:b/>
+                <w:sz w:val="20"/>
+              </w:rPr>
+            </w:r>
           </w:p>
         </w:tc>
         <w:tc>
@@ -4611,7 +5052,13 @@
                 <w:sz w:val="20"/>
               </w:rPr>
             </w:pPr>
-            <w:r/>
+            <w:r>
+              <w:rPr>
+                <w:rFonts w:ascii="Tahoma" w:hAnsi="Tahoma"/>
+                <w:b/>
+                <w:sz w:val="20"/>
+              </w:rPr>
+            </w:r>
           </w:p>
         </w:tc>
         <w:tc>
@@ -4629,7 +5076,13 @@
                 <w:sz w:val="20"/>
               </w:rPr>
             </w:pPr>
-            <w:r/>
+            <w:r>
+              <w:rPr>
+                <w:rFonts w:ascii="Tahoma" w:hAnsi="Tahoma"/>
+                <w:b/>
+                <w:sz w:val="20"/>
+              </w:rPr>
+            </w:r>
           </w:p>
         </w:tc>
       </w:tr>
@@ -4669,6 +5122,11 @@
               </w:rPr>
             </w:pPr>
             <w:r>
+              <w:rPr>
+                <w:rFonts w:ascii="Tahoma" w:hAnsi="Tahoma"/>
+                <w:b/>
+                <w:sz w:val="20"/>
+              </w:rPr>
               <w:t>{{ a.action }}</w:t>
             </w:r>
           </w:p>
@@ -4688,6 +5146,11 @@
               </w:rPr>
             </w:pPr>
             <w:r>
+              <w:rPr>
+                <w:rFonts w:ascii="Verdana" w:hAnsi="Verdana"/>
+                <w:b w:val="0"/>
+                <w:sz w:val="22"/>
+              </w:rPr>
               <w:t>{{ a.name }}</w:t>
             </w:r>
           </w:p>
@@ -4708,6 +5171,11 @@
               </w:rPr>
             </w:pPr>
             <w:r>
+              <w:rPr>
+                <w:rFonts w:ascii="Verdana" w:hAnsi="Verdana"/>
+                <w:b w:val="0"/>
+                <w:sz w:val="22"/>
+              </w:rPr>
               <w:t>{{ a.staff_id }}</w:t>
             </w:r>
           </w:p>
@@ -4726,7 +5194,12 @@
               </w:rPr>
             </w:pPr>
             <w:r>
-              <w:t>{{ a.signature }}</w:t>
+              <w:rPr>
+                <w:rFonts w:ascii="Verdana" w:hAnsi="Verdana"/>
+                <w:b w:val="0"/>
+                <w:sz w:val="22"/>
+              </w:rPr>
+              <w:t>{{ a.signature_img }}</w:t>
             </w:r>
           </w:p>
         </w:tc>
@@ -4746,6 +5219,11 @@
               </w:rPr>
             </w:pPr>
             <w:r>
+              <w:rPr>
+                <w:rFonts w:ascii="Verdana" w:hAnsi="Verdana"/>
+                <w:b w:val="0"/>
+                <w:sz w:val="22"/>
+              </w:rPr>
               <w:t>{{ a.date }}</w:t>
             </w:r>
           </w:p>
@@ -4787,6 +5265,11 @@
               </w:rPr>
             </w:pPr>
             <w:r>
+              <w:rPr>
+                <w:rFonts w:ascii="Verdana" w:hAnsi="Verdana"/>
+                <w:b w:val="0"/>
+                <w:sz w:val="22"/>
+              </w:rPr>
               <w:t>{%tr endfor %}</w:t>
             </w:r>
           </w:p>
@@ -4805,7 +5288,13 @@
                 <w:sz w:val="20"/>
               </w:rPr>
             </w:pPr>
-            <w:r/>
+            <w:r>
+              <w:rPr>
+                <w:rFonts w:ascii="Tahoma" w:hAnsi="Tahoma"/>
+                <w:b/>
+                <w:sz w:val="20"/>
+              </w:rPr>
+            </w:r>
           </w:p>
         </w:tc>
         <w:tc>
@@ -4823,7 +5312,13 @@
                 <w:sz w:val="20"/>
               </w:rPr>
             </w:pPr>
-            <w:r/>
+            <w:r>
+              <w:rPr>
+                <w:rFonts w:ascii="Tahoma" w:hAnsi="Tahoma"/>
+                <w:b/>
+                <w:sz w:val="20"/>
+              </w:rPr>
+            </w:r>
           </w:p>
         </w:tc>
         <w:tc>
@@ -4839,7 +5334,13 @@
                 <w:sz w:val="20"/>
               </w:rPr>
             </w:pPr>
-            <w:r/>
+            <w:r>
+              <w:rPr>
+                <w:rFonts w:ascii="Tahoma" w:hAnsi="Tahoma"/>
+                <w:b/>
+                <w:sz w:val="20"/>
+              </w:rPr>
+            </w:r>
           </w:p>
         </w:tc>
         <w:tc>
@@ -4857,7 +5358,13 @@
                 <w:sz w:val="20"/>
               </w:rPr>
             </w:pPr>
-            <w:r/>
+            <w:r>
+              <w:rPr>
+                <w:rFonts w:ascii="Tahoma" w:hAnsi="Tahoma"/>
+                <w:b/>
+                <w:sz w:val="20"/>
+              </w:rPr>
+            </w:r>
           </w:p>
         </w:tc>
       </w:tr>

</xml_diff>